<commit_message>
regenerated implementacao with font
</commit_message>
<xml_diff>
--- a/documento/ecdv-energias-renovaveis-v2.docx
+++ b/documento/ecdv-energias-renovaveis-v2.docx
@@ -782,9 +782,7 @@
         <w:spacing w:lineRule="auto" w:line="240" w:before="383" w:after="0"/>
         <w:ind w:hanging="0" w:left="0" w:right="165"/>
         <w:jc w:val="both"/>
-        <w:rPr>
-          <w:rFonts w:ascii="Avenir" w:hAnsi="Avenir"/>
-        </w:rPr>
+        <w:rPr/>
       </w:pPr>
       <w:r>
         <w:rPr>
@@ -830,7 +828,7 @@
         <w:shd w:val="clear" w:fill="auto"/>
         <w:spacing w:lineRule="auto" w:line="240" w:before="383" w:after="0"/>
         <w:ind w:hanging="0" w:left="50" w:right="167"/>
-        <w:jc w:val="left"/>
+        <w:jc w:val="both"/>
         <w:rPr>
           <w:rFonts w:ascii="Avenir" w:hAnsi="Avenir"/>
         </w:rPr>
@@ -971,13 +969,8 @@
         <w:shd w:val="clear" w:fill="auto"/>
         <w:spacing w:lineRule="auto" w:line="240" w:before="383" w:after="0"/>
         <w:ind w:hanging="0" w:left="50" w:right="167"/>
-        <w:jc w:val="left"/>
-        <w:rPr>
-          <w:rFonts w:ascii="Avenir" w:hAnsi="Avenir"/>
-          <w:i w:val="false"/>
-          <w:i w:val="false"/>
-          <w:iCs w:val="false"/>
-        </w:rPr>
+        <w:jc w:val="both"/>
+        <w:rPr/>
       </w:pPr>
       <w:r>
         <w:rPr>
@@ -1001,7 +994,7 @@
         <w:shd w:val="clear" w:fill="auto"/>
         <w:spacing w:lineRule="auto" w:line="240" w:before="383" w:after="0"/>
         <w:ind w:hanging="0" w:left="50" w:right="167"/>
-        <w:jc w:val="left"/>
+        <w:jc w:val="both"/>
         <w:rPr>
           <w:rFonts w:ascii="Avenir" w:hAnsi="Avenir"/>
         </w:rPr>
@@ -1060,24 +1053,17 @@
     <w:p>
       <w:pPr>
         <w:pStyle w:val="normal1"/>
-        <w:keepNext w:val="false"/>
-        <w:keepLines w:val="false"/>
         <w:pageBreakBefore w:val="false"/>
-        <w:widowControl w:val="false"/>
-        <w:shd w:val="clear" w:fill="auto"/>
         <w:spacing w:lineRule="auto" w:line="276" w:before="11" w:after="0"/>
-        <w:ind w:hanging="0" w:left="141" w:right="167"/>
-        <w:jc w:val="both"/>
+        <w:ind w:hanging="0" w:left="181" w:right="167"/>
+        <w:jc w:val="center"/>
         <w:rPr>
           <w:rFonts w:ascii="Avenir" w:hAnsi="Avenir"/>
         </w:rPr>
       </w:pPr>
       <w:r>
-        <w:rPr>
-          <w:rFonts w:ascii="Avenir" w:hAnsi="Avenir"/>
-        </w:rPr>
         <w:drawing>
-          <wp:anchor behindDoc="0" distT="0" distB="0" distL="0" distR="0" simplePos="0" locked="0" layoutInCell="0" allowOverlap="1" relativeHeight="9">
+          <wp:anchor behindDoc="0" distT="0" distB="0" distL="0" distR="0" simplePos="0" locked="0" layoutInCell="0" allowOverlap="1" relativeHeight="8">
             <wp:simplePos x="0" y="0"/>
             <wp:positionH relativeFrom="column">
               <wp:align>center</wp:align>
@@ -1122,17 +1108,6 @@
           </wp:anchor>
         </w:drawing>
       </w:r>
-    </w:p>
-    <w:p>
-      <w:pPr>
-        <w:pStyle w:val="normal1"/>
-        <w:spacing w:lineRule="auto" w:line="276" w:before="11" w:after="0"/>
-        <w:ind w:hanging="0" w:left="181" w:right="167"/>
-        <w:jc w:val="center"/>
-        <w:rPr>
-          <w:rFonts w:ascii="Avenir" w:hAnsi="Avenir"/>
-        </w:rPr>
-      </w:pPr>
       <w:r>
         <w:rPr>
           <w:rFonts w:eastAsia="Avenir" w:cs="Avenir" w:ascii="Avenir" w:hAnsi="Avenir"/>
@@ -1193,7 +1168,7 @@
       </w:pPr>
       <w:r>
         <w:drawing>
-          <wp:anchor behindDoc="0" distT="0" distB="0" distL="0" distR="0" simplePos="0" locked="0" layoutInCell="0" allowOverlap="1" relativeHeight="6">
+          <wp:anchor behindDoc="0" distT="0" distB="0" distL="0" distR="0" simplePos="0" locked="0" layoutInCell="0" allowOverlap="1" relativeHeight="9">
             <wp:simplePos x="0" y="0"/>
             <wp:positionH relativeFrom="column">
               <wp:align>center</wp:align>
@@ -1201,7 +1176,7 @@
             <wp:positionV relativeFrom="paragraph">
               <wp:posOffset>635</wp:posOffset>
             </wp:positionV>
-            <wp:extent cx="2875915" cy="1214755"/>
+            <wp:extent cx="2781935" cy="1104900"/>
             <wp:effectExtent l="0" t="0" r="0" b="0"/>
             <wp:wrapSquare wrapText="largest"/>
             <wp:docPr id="4" name="Image1" descr=""/>
@@ -1226,7 +1201,7 @@
                   <pic:spPr bwMode="auto">
                     <a:xfrm>
                       <a:off x="0" y="0"/>
-                      <a:ext cx="2875915" cy="1214755"/>
+                      <a:ext cx="2781935" cy="1104900"/>
                     </a:xfrm>
                     <a:prstGeom prst="rect">
                       <a:avLst/>
@@ -1323,19 +1298,17 @@
         <w:spacing w:lineRule="auto" w:line="276" w:before="11" w:after="0"/>
         <w:ind w:hanging="0" w:left="181" w:right="167"/>
         <w:jc w:val="center"/>
-        <w:rPr>
-          <w:rFonts w:ascii="Avenir" w:hAnsi="Avenir"/>
-        </w:rPr>
+        <w:rPr/>
       </w:pPr>
       <w:r>
         <w:drawing>
-          <wp:anchor behindDoc="0" distT="0" distB="0" distL="0" distR="0" simplePos="0" locked="0" layoutInCell="0" allowOverlap="1" relativeHeight="7">
+          <wp:anchor behindDoc="0" distT="0" distB="0" distL="0" distR="0" simplePos="0" locked="0" layoutInCell="0" allowOverlap="1" relativeHeight="6">
             <wp:simplePos x="0" y="0"/>
             <wp:positionH relativeFrom="column">
               <wp:align>center</wp:align>
             </wp:positionH>
             <wp:positionV relativeFrom="paragraph">
-              <wp:align>top</wp:align>
+              <wp:posOffset>635</wp:posOffset>
             </wp:positionV>
             <wp:extent cx="2026285" cy="1882775"/>
             <wp:effectExtent l="0" t="0" r="0" b="0"/>
@@ -1435,7 +1408,7 @@
       </w:pPr>
       <w:r>
         <w:drawing>
-          <wp:anchor behindDoc="0" distT="0" distB="0" distL="0" distR="0" simplePos="0" locked="0" layoutInCell="0" allowOverlap="1" relativeHeight="8">
+          <wp:anchor behindDoc="0" distT="0" distB="0" distL="0" distR="0" simplePos="0" locked="0" layoutInCell="0" allowOverlap="1" relativeHeight="7">
             <wp:simplePos x="0" y="0"/>
             <wp:positionH relativeFrom="column">
               <wp:align>center</wp:align>
@@ -1671,7 +1644,7 @@
       <w:hyperlink r:id="rId10">
         <w:r>
           <w:rPr>
-            <w:rStyle w:val="ListLabel3"/>
+            <w:rStyle w:val="ListLabel2"/>
             <w:rFonts w:eastAsia="Avenir" w:cs="Avenir" w:ascii="Avenir" w:hAnsi="Avenir"/>
             <w:b w:val="false"/>
             <w:bCs w:val="false"/>
@@ -2206,7 +2179,7 @@
     </w:r>
     <w:r>
       <w:rPr/>
-      <w:t>3</w:t>
+      <w:t>2</w:t>
     </w:r>
     <w:r>
       <w:rPr/>
@@ -2264,7 +2237,7 @@
     </w:r>
     <w:r>
       <w:rPr/>
-      <w:t>3</w:t>
+      <w:t>2</w:t>
     </w:r>
     <w:r>
       <w:rPr/>

</xml_diff>